<commit_message>
Lagerbewegung Wareneingang hinzugefügt, als seperaten Bereich, falls Gegenstände dem Inventar hinzugefügt werden
</commit_message>
<xml_diff>
--- a/Docs/Lagerverwaltungssystem-Technische_Doku_Matthias_Utrata.docx
+++ b/Docs/Lagerverwaltungssystem-Technische_Doku_Matthias_Utrata.docx
@@ -4653,6 +4653,10 @@
     </w:p>
     <w:p>
       <w:r>
+        <w:rPr>
+          <w:noProof/>
+          <w:lang w:eastAsia="de-DE"/>
+        </w:rPr>
         <w:drawing>
           <wp:inline distT="0" distB="0" distL="0" distR="0" wp14:anchorId="08D81915" wp14:editId="6546E842">
             <wp:extent cx="3077004" cy="2057687"/>
@@ -4902,13 +4906,16 @@
         <w:t xml:space="preserve"> hinzugefügt</w:t>
       </w:r>
       <w:r>
-        <w:t xml:space="preserve">, weil manche Views die Informationen aus zwei verschiedenen Models </w:t>
+        <w:t xml:space="preserve">, weil manche Views die Informationen aus verschiedenen Models </w:t>
       </w:r>
       <w:r>
         <w:t>brauchen</w:t>
       </w:r>
       <w:r>
         <w:t>.</w:t>
+      </w:r>
+      <w:r>
+        <w:t xml:space="preserve"> Die Tabellen aus der Datenbank wurden 1:1 als Models übernommen.</w:t>
       </w:r>
     </w:p>
     <w:p>
@@ -4939,7 +4946,62 @@
         <w:t>Zu den wichtigen eigene</w:t>
       </w:r>
       <w:r>
-        <w:t>n Klassen gehören die Services, die dafür da sind, dass bestimmte Aktionen, die man in mehreren Dateien braucht, nicht mehrfach geschrieben werden.</w:t>
+        <w:t>n Klassen</w:t>
+      </w:r>
+      <w:r>
+        <w:t xml:space="preserve"> gehören die Services, die für die Logik und Validierung verantwortlich sind und außerhalb der Controller Schicht sind.</w:t>
+      </w:r>
+      <w:r>
+        <w:t xml:space="preserve"> Die Services mussten</w:t>
+      </w:r>
+      <w:r>
+        <w:t xml:space="preserve"> zusätzlich</w:t>
+      </w:r>
+      <w:r>
+        <w:t xml:space="preserve"> als Scopes in der </w:t>
+      </w:r>
+      <w:proofErr w:type="spellStart"/>
+      <w:r>
+        <w:t>Progr</w:t>
+      </w:r>
+      <w:r>
+        <w:t>am.cs</w:t>
+      </w:r>
+      <w:proofErr w:type="spellEnd"/>
+      <w:r>
+        <w:t xml:space="preserve"> Datei mit </w:t>
+      </w:r>
+      <w:r>
+        <w:t>„</w:t>
+      </w:r>
+      <w:proofErr w:type="spellStart"/>
+      <w:proofErr w:type="gramStart"/>
+      <w:r>
+        <w:t>builder.Services.AddScoped</w:t>
+      </w:r>
+      <w:proofErr w:type="spellEnd"/>
+      <w:proofErr w:type="gramEnd"/>
+      <w:r>
+        <w:t>&lt;</w:t>
+      </w:r>
+      <w:proofErr w:type="spellStart"/>
+      <w:r>
+        <w:t>NameDesService</w:t>
+      </w:r>
+      <w:proofErr w:type="spellEnd"/>
+      <w:r>
+        <w:t>&gt;();</w:t>
+      </w:r>
+      <w:r>
+        <w:t>“</w:t>
+      </w:r>
+      <w:bookmarkStart w:id="2" w:name="_GoBack"/>
+      <w:bookmarkEnd w:id="2"/>
+      <w:r>
+        <w:t xml:space="preserve"> registrie</w:t>
+      </w:r>
+      <w:r>
+        <w:t>rt und werden von den Controllern aufgerufen.</w:t>
       </w:r>
     </w:p>
     <w:p/>
@@ -4947,12 +5009,12 @@
       <w:pPr>
         <w:pStyle w:val="berschrift1"/>
       </w:pPr>
-      <w:bookmarkStart w:id="2" w:name="_Toc241667914"/>
+      <w:bookmarkStart w:id="3" w:name="_Toc241667914"/>
       <w:r>
         <w:lastRenderedPageBreak/>
         <w:t>Datenmodell</w:t>
       </w:r>
-      <w:bookmarkEnd w:id="2"/>
+      <w:bookmarkEnd w:id="3"/>
     </w:p>
     <w:p>
       <w:r>
@@ -4976,7 +5038,7 @@
             <v:path o:extrusionok="f" gradientshapeok="t" o:connecttype="rect"/>
             <o:lock v:ext="edit" aspectratio="t"/>
           </v:shapetype>
-          <v:shape id="_x0000_i1027" type="#_x0000_t75" style="width:453pt;height:223.45pt">
+          <v:shape id="_x0000_i1025" type="#_x0000_t75" style="width:452.95pt;height:223.5pt">
             <v:imagedata r:id="rId11" o:title="Lagerverwaltung - ER Diagramm"/>
           </v:shape>
         </w:pict>
@@ -5087,11 +5149,11 @@
       <w:pPr>
         <w:pStyle w:val="berschrift1"/>
       </w:pPr>
-      <w:bookmarkStart w:id="3" w:name="_Toc241667915"/>
+      <w:bookmarkStart w:id="4" w:name="_Toc241667915"/>
       <w:r>
         <w:t>Eine zentrale Funktion Schritt für Schritt</w:t>
       </w:r>
-      <w:bookmarkEnd w:id="3"/>
+      <w:bookmarkEnd w:id="4"/>
     </w:p>
     <w:p>
       <w:pPr>
@@ -5119,23 +5181,18 @@
           <w:color w:val="FF0000"/>
         </w:rPr>
       </w:pPr>
-      <w:bookmarkStart w:id="4" w:name="_Toc241667916"/>
+      <w:bookmarkStart w:id="5" w:name="_Toc241667916"/>
       <w:r>
         <w:t>Rollen und Berechtigungen</w:t>
       </w:r>
-      <w:bookmarkEnd w:id="4"/>
+      <w:bookmarkEnd w:id="5"/>
     </w:p>
     <w:p>
       <w:r>
         <w:t xml:space="preserve">Das Anmeldefenster sieht man zuerst bevor </w:t>
       </w:r>
       <w:r>
-        <w:t>man üb</w:t>
-      </w:r>
-      <w:bookmarkStart w:id="5" w:name="_GoBack"/>
-      <w:bookmarkEnd w:id="5"/>
-      <w:r>
-        <w:t xml:space="preserve">erhaupt in die Anwendung gelangt. </w:t>
+        <w:t xml:space="preserve">man überhaupt in die Anwendung gelangt. </w:t>
       </w:r>
       <w:r>
         <w:t>Nur angemeldete Nutzer dürfen sich ins System einloggen.</w:t>
@@ -5204,6 +5261,10 @@
     </w:p>
     <w:p>
       <w:r>
+        <w:rPr>
+          <w:noProof/>
+          <w:lang w:eastAsia="de-DE"/>
+        </w:rPr>
         <w:drawing>
           <wp:inline distT="0" distB="0" distL="0" distR="0" wp14:anchorId="149631FE" wp14:editId="61088A27">
             <wp:extent cx="5760720" cy="1562100"/>
@@ -6105,7 +6166,7 @@
 </file>
 
 <file path=customXml/itemProps2.xml><?xml version="1.0" encoding="utf-8"?>
-<ds:datastoreItem xmlns:ds="http://schemas.openxmlformats.org/officeDocument/2006/customXml" ds:itemID="{26922F82-47C9-48A0-983E-F9249ADB8AA3}">
+<ds:datastoreItem xmlns:ds="http://schemas.openxmlformats.org/officeDocument/2006/customXml" ds:itemID="{BE829CE6-D0DF-400F-A606-87C3195DAF56}">
   <ds:schemaRefs>
     <ds:schemaRef ds:uri="http://schemas.openxmlformats.org/officeDocument/2006/bibliography"/>
   </ds:schemaRefs>

</xml_diff>

<commit_message>
Funktion für Stornierung von Ausleihen eingegeben
</commit_message>
<xml_diff>
--- a/Docs/Lagerverwaltungssystem-Technische_Doku_Matthias_Utrata.docx
+++ b/Docs/Lagerverwaltungssystem-Technische_Doku_Matthias_Utrata.docx
@@ -4995,8 +4995,6 @@
       <w:r>
         <w:t>“</w:t>
       </w:r>
-      <w:bookmarkStart w:id="2" w:name="_GoBack"/>
-      <w:bookmarkEnd w:id="2"/>
       <w:r>
         <w:t xml:space="preserve"> registrie</w:t>
       </w:r>
@@ -5009,12 +5007,12 @@
       <w:pPr>
         <w:pStyle w:val="berschrift1"/>
       </w:pPr>
-      <w:bookmarkStart w:id="3" w:name="_Toc241667914"/>
+      <w:bookmarkStart w:id="2" w:name="_Toc241667914"/>
       <w:r>
         <w:lastRenderedPageBreak/>
         <w:t>Datenmodell</w:t>
       </w:r>
-      <w:bookmarkEnd w:id="3"/>
+      <w:bookmarkEnd w:id="2"/>
     </w:p>
     <w:p>
       <w:r>
@@ -5149,11 +5147,11 @@
       <w:pPr>
         <w:pStyle w:val="berschrift1"/>
       </w:pPr>
-      <w:bookmarkStart w:id="4" w:name="_Toc241667915"/>
+      <w:bookmarkStart w:id="3" w:name="_Toc241667915"/>
       <w:r>
         <w:t>Eine zentrale Funktion Schritt für Schritt</w:t>
       </w:r>
-      <w:bookmarkEnd w:id="4"/>
+      <w:bookmarkEnd w:id="3"/>
     </w:p>
     <w:p>
       <w:pPr>
@@ -5181,11 +5179,11 @@
           <w:color w:val="FF0000"/>
         </w:rPr>
       </w:pPr>
-      <w:bookmarkStart w:id="5" w:name="_Toc241667916"/>
+      <w:bookmarkStart w:id="4" w:name="_Toc241667916"/>
       <w:r>
         <w:t>Rollen und Berechtigungen</w:t>
       </w:r>
-      <w:bookmarkEnd w:id="5"/>
+      <w:bookmarkEnd w:id="4"/>
     </w:p>
     <w:p>
       <w:r>
@@ -5250,7 +5248,16 @@
         <w:t xml:space="preserve"> = „Admin“)]</w:t>
       </w:r>
       <w:r>
-        <w:t xml:space="preserve"> geschützt. Nur ein Nutzer, dessen Rolle eine Admin-Rolle ist, kann die betroffenen Controller und dessen enthaltene Aktionen ausführen.</w:t>
+        <w:t xml:space="preserve"> geschützt. Nur ein Nutzer, dessen Rolle eine Admin-Rolle ist, kann die betroffenen Controller und dessen enthaltene Aktionen</w:t>
+      </w:r>
+      <w:r>
+        <w:t xml:space="preserve"> </w:t>
+      </w:r>
+      <w:r>
+        <w:t>ausführen.</w:t>
+      </w:r>
+      <w:r>
+        <w:t xml:space="preserve"> </w:t>
       </w:r>
     </w:p>
     <w:p>
@@ -5328,26 +5335,72 @@
       <w:pPr>
         <w:pStyle w:val="berschrift1"/>
       </w:pPr>
-      <w:bookmarkStart w:id="6" w:name="_Toc241667917"/>
+      <w:bookmarkStart w:id="5" w:name="_Toc241667917"/>
       <w:r>
         <w:t>Test eines vollständigen Geschäftsprozesses</w:t>
       </w:r>
-      <w:bookmarkEnd w:id="6"/>
+      <w:bookmarkEnd w:id="5"/>
     </w:p>
     <w:p>
       <w:pPr>
-        <w:rPr>
-          <w:color w:val="FF0000"/>
-        </w:rPr>
+        <w:pStyle w:val="KeinLeerraum"/>
       </w:pPr>
       <w:r>
-        <w:rPr>
-          <w:color w:val="FF0000"/>
-        </w:rPr>
-        <w:t>Dokumentieren eines vollständigen Ablaufs mit Testdaten und Screenshots</w:t>
+        <w:t>Beim Ausführen des Programms landet man zuerst auf der Login-Page.</w:t>
+      </w:r>
+      <w:r>
+        <w:t xml:space="preserve"> Man bekommt dafür zuerst die Login Informationen vom Admin.</w:t>
       </w:r>
     </w:p>
-    <w:p/>
+    <w:p>
+      <w:pPr>
+        <w:pStyle w:val="KeinLeerraum"/>
+      </w:pPr>
+      <w:r>
+        <w:drawing>
+          <wp:inline distT="0" distB="0" distL="0" distR="0" wp14:anchorId="6D35F72F" wp14:editId="478CDC60">
+            <wp:extent cx="2959240" cy="2507364"/>
+            <wp:effectExtent l="0" t="0" r="0" b="7620"/>
+            <wp:docPr id="38" name="Grafik 38"/>
+            <wp:cNvGraphicFramePr>
+              <a:graphicFrameLocks xmlns:a="http://schemas.openxmlformats.org/drawingml/2006/main" noChangeAspect="1"/>
+            </wp:cNvGraphicFramePr>
+            <a:graphic xmlns:a="http://schemas.openxmlformats.org/drawingml/2006/main">
+              <a:graphicData uri="http://schemas.openxmlformats.org/drawingml/2006/picture">
+                <pic:pic xmlns:pic="http://schemas.openxmlformats.org/drawingml/2006/picture">
+                  <pic:nvPicPr>
+                    <pic:cNvPr id="1" name=""/>
+                    <pic:cNvPicPr/>
+                  </pic:nvPicPr>
+                  <pic:blipFill>
+                    <a:blip r:embed="rId13"/>
+                    <a:stretch>
+                      <a:fillRect/>
+                    </a:stretch>
+                  </pic:blipFill>
+                  <pic:spPr>
+                    <a:xfrm>
+                      <a:off x="0" y="0"/>
+                      <a:ext cx="2979386" cy="2524434"/>
+                    </a:xfrm>
+                    <a:prstGeom prst="rect">
+                      <a:avLst/>
+                    </a:prstGeom>
+                  </pic:spPr>
+                </pic:pic>
+              </a:graphicData>
+            </a:graphic>
+          </wp:inline>
+        </w:drawing>
+      </w:r>
+    </w:p>
+    <w:p>
+      <w:pPr>
+        <w:pStyle w:val="KeinLeerraum"/>
+      </w:pPr>
+      <w:bookmarkStart w:id="6" w:name="_GoBack"/>
+      <w:bookmarkEnd w:id="6"/>
+    </w:p>
     <w:sectPr>
       <w:pgSz w:w="11906" w:h="16838"/>
       <w:pgMar w:top="1417" w:right="1417" w:bottom="1134" w:left="1417" w:header="708" w:footer="708" w:gutter="0"/>
@@ -6166,7 +6219,7 @@
 </file>
 
 <file path=customXml/itemProps2.xml><?xml version="1.0" encoding="utf-8"?>
-<ds:datastoreItem xmlns:ds="http://schemas.openxmlformats.org/officeDocument/2006/customXml" ds:itemID="{BE829CE6-D0DF-400F-A606-87C3195DAF56}">
+<ds:datastoreItem xmlns:ds="http://schemas.openxmlformats.org/officeDocument/2006/customXml" ds:itemID="{D9FCCD82-CEBC-46DF-9E2F-7D860CD64A33}">
   <ds:schemaRefs>
     <ds:schemaRef ds:uri="http://schemas.openxmlformats.org/officeDocument/2006/bibliography"/>
   </ds:schemaRefs>

</xml_diff>

<commit_message>
Zweite visuelle Version von Ausleihe eingebaut zum Vergleich
</commit_message>
<xml_diff>
--- a/Docs/Lagerverwaltungssystem-Technische_Doku_Matthias_Utrata.docx
+++ b/Docs/Lagerverwaltungssystem-Technische_Doku_Matthias_Utrata.docx
@@ -4940,6 +4940,14 @@
       <w:r>
         <w:t xml:space="preserve"> eingetragen.</w:t>
       </w:r>
+      <w:r>
+        <w:t xml:space="preserve"> Die Erstellung der Datenbank im Hintergr</w:t>
+      </w:r>
+      <w:r>
+        <w:t>und erfolgte via Database-first in SQL Server Management Studio 22.</w:t>
+      </w:r>
+      <w:bookmarkStart w:id="2" w:name="_GoBack"/>
+      <w:bookmarkEnd w:id="2"/>
     </w:p>
     <w:p>
       <w:r>
@@ -5007,12 +5015,12 @@
       <w:pPr>
         <w:pStyle w:val="berschrift1"/>
       </w:pPr>
-      <w:bookmarkStart w:id="2" w:name="_Toc241667914"/>
+      <w:bookmarkStart w:id="3" w:name="_Toc241667914"/>
       <w:r>
         <w:lastRenderedPageBreak/>
         <w:t>Datenmodell</w:t>
       </w:r>
-      <w:bookmarkEnd w:id="2"/>
+      <w:bookmarkEnd w:id="3"/>
     </w:p>
     <w:p>
       <w:r>
@@ -5147,11 +5155,11 @@
       <w:pPr>
         <w:pStyle w:val="berschrift1"/>
       </w:pPr>
-      <w:bookmarkStart w:id="3" w:name="_Toc241667915"/>
+      <w:bookmarkStart w:id="4" w:name="_Toc241667915"/>
       <w:r>
         <w:t>Eine zentrale Funktion Schritt für Schritt</w:t>
       </w:r>
-      <w:bookmarkEnd w:id="3"/>
+      <w:bookmarkEnd w:id="4"/>
     </w:p>
     <w:p>
       <w:pPr>
@@ -5179,11 +5187,11 @@
           <w:color w:val="FF0000"/>
         </w:rPr>
       </w:pPr>
-      <w:bookmarkStart w:id="4" w:name="_Toc241667916"/>
+      <w:bookmarkStart w:id="5" w:name="_Toc241667916"/>
       <w:r>
         <w:t>Rollen und Berechtigungen</w:t>
       </w:r>
-      <w:bookmarkEnd w:id="4"/>
+      <w:bookmarkEnd w:id="5"/>
     </w:p>
     <w:p>
       <w:r>
@@ -5335,11 +5343,11 @@
       <w:pPr>
         <w:pStyle w:val="berschrift1"/>
       </w:pPr>
-      <w:bookmarkStart w:id="5" w:name="_Toc241667917"/>
+      <w:bookmarkStart w:id="6" w:name="_Toc241667917"/>
       <w:r>
         <w:t>Test eines vollständigen Geschäftsprozesses</w:t>
       </w:r>
-      <w:bookmarkEnd w:id="5"/>
+      <w:bookmarkEnd w:id="6"/>
     </w:p>
     <w:p>
       <w:pPr>
@@ -5398,8 +5406,6 @@
       <w:pPr>
         <w:pStyle w:val="KeinLeerraum"/>
       </w:pPr>
-      <w:bookmarkStart w:id="6" w:name="_GoBack"/>
-      <w:bookmarkEnd w:id="6"/>
     </w:p>
     <w:sectPr>
       <w:pgSz w:w="11906" w:h="16838"/>
@@ -6219,7 +6225,7 @@
 </file>
 
 <file path=customXml/itemProps2.xml><?xml version="1.0" encoding="utf-8"?>
-<ds:datastoreItem xmlns:ds="http://schemas.openxmlformats.org/officeDocument/2006/customXml" ds:itemID="{D9FCCD82-CEBC-46DF-9E2F-7D860CD64A33}">
+<ds:datastoreItem xmlns:ds="http://schemas.openxmlformats.org/officeDocument/2006/customXml" ds:itemID="{1AC8DD95-FDA9-4DBF-8B51-D73F95C1D822}">
   <ds:schemaRefs>
     <ds:schemaRef ds:uri="http://schemas.openxmlformats.org/officeDocument/2006/bibliography"/>
   </ds:schemaRefs>

</xml_diff>

<commit_message>
"Transfer" durch "Ausleihe" ersetzt
Transfer und Ausleihe bedeuten dasselbe, daher heißt es im ganzen Projekt
nur mehr Ausleihe:
- Oberfläche: Buttons ("Ausleihe anfragen"), Freigaben, Profil, Übersicht,
  Benutzerliste, Katalog-Status "In Ausleihe" und alle Meldungen
- Code: Kommentare und Bezeichner (OffeneAusleihen, InAusleihe, kannAusleihen).
  Die CSS-Klassen transfer-* heißen jetzt buchung-*, weil es ausleihe-raster
  und ausleihe-auswahl schon mit anderen Regeln gibt
- Testdaten.sql (Kommentar) und technische Doku
- Tutorial: aktuelle Fassung übernommen, Screenshots liegen wie dort
  verlinkt unter Mockups/ und wurden neu erstellt

Co-Authored-By: Claude Opus 5.5 <noreply@anthropic.com>
Claude-Session: https://claude.ai/code/session_01MAe5QCMjWhcnw2YaHqo41Y
</commit_message>
<xml_diff>
--- a/Docs/Lagerverwaltungssystem-Technische_Doku_Matthias_Utrata.docx
+++ b/Docs/Lagerverwaltungssystem-Technische_Doku_Matthias_Utrata.docx
@@ -13741,7 +13741,7 @@
               <w:pStyle w:val="Tabellentext"/>
             </w:pPr>
             <w:r>
-              <w:t>Neue Ausleihe (Transfer aus dem eigenen Raum in einen anderen)</w:t>
+              <w:t>Neue Ausleihe (aus dem eigenen Raum in einen anderen)</w:t>
             </w:r>
           </w:p>
         </w:tc>
@@ -15449,7 +15449,7 @@
         <w:keepNext/>
       </w:pPr>
       <w:r>
-        <w:t xml:space="preserve">    // Offene Bewegungen, die die Person freigeben muss: Transfers in den eigenen Raum und aus ihm geholte Geräte</w:t>
+        <w:t xml:space="preserve">    // Offene Bewegungen, die die Person freigeben muss: Ausleihen in den eigenen Raum und aus ihm geholte Geräte</w:t>
       </w:r>
     </w:p>
     <w:p>

</xml_diff>